<commit_message>
Fix inaccurate trainer-lock claim in the plain-English how-it-works doc
Section 5.2 claimed a trainer-specific package (e.g. "Pilates (Darlene)")
is technically enforced to only work with that trainer. That's not what
the code does — packages match by class type only, never by which trainer
is actually assigned to a given session. Corrected the claim and added a
clarifying nuance paragraph with a concrete example, so staff understand
the actual safeguard is naming/practice (always assigning the right
trainer by default), not a hard lock the system enforces.

Co-Authored-By: Claude Sonnet 5 <noreply@anthropic.com>
</commit_message>
<xml_diff>
--- a/docs/How-P4Studio-Works-Plain-English.docx
+++ b/docs/How-P4Studio-Works-Plain-English.docx
@@ -1932,7 +1932,26 @@
         <w:spacing w:after="160"/>
       </w:pPr>
       <w:r>
-        <w:t xml:space="preserve">Both are set up from Settings. A plan needs a name, price, classes per cycle, cycle length and any perks. A package needs a name, the one service it unlocks, how many sessions it grants, a price, how many days it's valid for, and any perks. Because a package is scoped to a single service (which may itself be trainer-specific, like "Pilates (Maryam)"), building a package around a trainer-specific service is also how the studio enforces that a member's private-session package can only be spent with that trainer.</w:t>
+        <w:t xml:space="preserve">Both are set up from Settings. A plan needs a name, price, classes per cycle, cycle length and any perks. A package needs a name, the one class type it unlocks, how many sessions it grants, a price, how many days it's valid for, and any perks.</w:t>
+      </w:r>
+    </w:p>
+    <w:p>
+      <w:pPr>
+        <w:spacing w:after="160"/>
+      </w:pPr>
+      <w:r>
+        <w:rPr>
+          <w:b/>
+        </w:rPr>
+        <w:t xml:space="preserve">Important nuance: a package is matched by class type, not by trainer.</w:t>
+      </w:r>
+    </w:p>
+    <w:p>
+      <w:pPr>
+        <w:spacing w:after="160"/>
+      </w:pPr>
+      <w:r>
+        <w:t xml:space="preserve">A package only checks which class type a session belongs to — it never checks who is actually teaching it. A trainer-specific service like “Pilates (Darlene)” is its own distinct class type, so a package built on it unlocks any session staff scheduled under that same class type. In normal use this works exactly as expected: staff create “Pilates (Darlene)” sessions with Darlene assigned, and the New Session form even defaults to her automatically once that class type is picked. But nothing technically stops staff from assigning a substitute trainer to a session still filed under the “Pilates (Darlene)” class type — if that happens, the package is still accepted, even though someone else is teaching that particular session. The safeguard is naming and staff practice, not a hard trainer lock in the system.</w:t>
       </w:r>
     </w:p>
     <w:p>

</xml_diff>